<commit_message>
Fix segmentation evaluation for test images without water
Per-image IoU averaged over all test images scored a correct "no water"
prediction as 0, which dominated the Khurdopin and Shishper results.
Section 8 now reports pixel-pooled metrics (overall and per site),
per-image metrics on images containing water, and false-positive area
on images without water. All figures and result tables are also saved
to the cache folder. Deliverable tables and text updated accordingly.

Co-Authored-By: Claude Opus 5.5 <noreply@anthropic.com>
</commit_message>
<xml_diff>
--- a/reports/deliverables/Deliverable_2_Methodology.docx
+++ b/reports/deliverables/Deliverable_2_Methodology.docx
@@ -8387,7 +8387,7 @@
         <w:rPr>
           <w:rFonts w:ascii="Times New Roman" w:cs="Times New Roman" w:eastAsia="Times New Roman" w:hAnsi="Times New Roman"/>
         </w:rPr>
-        <w:t xml:space="preserve">Predictions are evaluated per test image on valid pixels only, using intersection-over-union (IoU), F1-score (Dice), precision and recall, with TP, FP and FN the numbers of true-positive, false-positive and false-negative water pixels:</w:t>
+        <w:t xml:space="preserve">Predictions are evaluated on the valid (non-cloud) pixels of the test images using intersection-over-union (IoU), F1-score (Dice), precision and recall, with TP, FP and FN the numbers of true-positive, false-positive and false-negative water pixels:</w:t>
       </w:r>
     </w:p>
     <w:p>
@@ -8494,7 +8494,21 @@
         <w:rPr>
           <w:rFonts w:ascii="Times New Roman" w:cs="Times New Roman" w:eastAsia="Times New Roman" w:hAnsi="Times New Roman"/>
         </w:rPr>
-        <w:t xml:space="preserve">IoU is the standard segmentation metric and directly reflects errors in lake extent, which is the quantity used downstream. F1 is reported for comparability with the literature reviewed in Section II. Precision and recall separate over-detection (e.g. shadows or wet ice classified as water) from under-detection (e.g. turbid or partly frozen lakes). Overall accuracy is not used because it would be dominated by the land class. Metrics are reported as the mean ± standard deviation over test images, per site and pooled.</w:t>
+        <w:t xml:space="preserve">IoU is the standard segmentation metric and directly reflects errors in lake extent, which is the quantity used downstream. F1 is reported for comparability with the literature reviewed in Section II. Precision and recall separate over-detection (e.g. shadows or wet ice classified as water) from under-detection (e.g. turbid or partly frozen lakes). Overall accuracy is not used because it would be dominated by the land class. Many test images contain no lake water (Khurdopin after 2017, Shishper after each drainage); per-image IoU is undefined for them, and averaging it would score a correct "no water" prediction as zero. The main results are therefore </w:t>
+      </w:r>
+      <w:r>
+        <w:rPr>
+          <w:rFonts w:ascii="Times New Roman" w:cs="Times New Roman" w:eastAsia="Times New Roman" w:hAnsi="Times New Roman"/>
+          <w:b/>
+          <w:bCs/>
+        </w:rPr>
+        <w:t xml:space="preserve">pixel-pooled</w:t>
+      </w:r>
+      <w:r>
+        <w:rPr>
+          <w:rFonts w:ascii="Times New Roman" w:cs="Times New Roman" w:eastAsia="Times New Roman" w:hAnsi="Times New Roman"/>
+        </w:rPr>
+        <w:t xml:space="preserve"> metrics, for which TP, FP and FN are summed over all test pixels of a site (or of all sites) before the metric is computed. In addition, per-image metrics are reported as mean ± standard deviation over the test images that contain water, and the false-positive area is reported for test images without water.</w:t>
       </w:r>
     </w:p>
     <w:p>

</xml_diff>